<commit_message>
Final empirical results synchronization and documentation alignment
</commit_message>
<xml_diff>
--- a/docs/FINAL_RESEARCH_RESULTS_COMPENDIUM.docx
+++ b/docs/FINAL_RESEARCH_RESULTS_COMPENDIUM.docx
@@ -106,15 +106,29 @@
         <w:tblLook w:firstColumn="1" w:firstRow="1" w:lastColumn="0" w:lastRow="0" w:noHBand="0" w:noVBand="1" w:val="04A0"/>
       </w:tblPr>
       <w:tblGrid>
-        <w:gridCol w:w="2160"/>
-        <w:gridCol w:w="2160"/>
-        <w:gridCol w:w="2160"/>
-        <w:gridCol w:w="2160"/>
+        <w:gridCol w:w="1080"/>
+        <w:gridCol w:w="1080"/>
+        <w:gridCol w:w="1080"/>
+        <w:gridCol w:w="1080"/>
+        <w:gridCol w:w="1080"/>
+        <w:gridCol w:w="1080"/>
+        <w:gridCol w:w="1080"/>
+        <w:gridCol w:w="1080"/>
       </w:tblGrid>
       <w:tr>
         <w:tc>
           <w:tcPr>
-            <w:tcW w:type="dxa" w:w="2160"/>
+            <w:tcW w:type="dxa" w:w="1080"/>
+          </w:tcPr>
+          <w:p>
+            <w:r>
+              <w:t>Market</w:t>
+            </w:r>
+          </w:p>
+        </w:tc>
+        <w:tc>
+          <w:tcPr>
+            <w:tcW w:type="dxa" w:w="1080"/>
           </w:tcPr>
           <w:p>
             <w:r>
@@ -124,7 +138,27 @@
         </w:tc>
         <w:tc>
           <w:tcPr>
-            <w:tcW w:type="dxa" w:w="2160"/>
+            <w:tcW w:type="dxa" w:w="1080"/>
+          </w:tcPr>
+          <w:p>
+            <w:r>
+              <w:t>Return</w:t>
+            </w:r>
+          </w:p>
+        </w:tc>
+        <w:tc>
+          <w:tcPr>
+            <w:tcW w:type="dxa" w:w="1080"/>
+          </w:tcPr>
+          <w:p>
+            <w:r>
+              <w:t>Volatility</w:t>
+            </w:r>
+          </w:p>
+        </w:tc>
+        <w:tc>
+          <w:tcPr>
+            <w:tcW w:type="dxa" w:w="1080"/>
           </w:tcPr>
           <w:p>
             <w:r>
@@ -134,21 +168,31 @@
         </w:tc>
         <w:tc>
           <w:tcPr>
-            <w:tcW w:type="dxa" w:w="2160"/>
+            <w:tcW w:type="dxa" w:w="1080"/>
           </w:tcPr>
           <w:p>
             <w:r>
-              <w:t>Return</w:t>
+              <w:t>Turnover</w:t>
             </w:r>
           </w:p>
         </w:tc>
         <w:tc>
           <w:tcPr>
-            <w:tcW w:type="dxa" w:w="2160"/>
+            <w:tcW w:type="dxa" w:w="1080"/>
           </w:tcPr>
           <w:p>
             <w:r>
-              <w:t>Volatility</w:t>
+              <w:t>ASI</w:t>
+            </w:r>
+          </w:p>
+        </w:tc>
+        <w:tc>
+          <w:tcPr>
+            <w:tcW w:type="dxa" w:w="1080"/>
+          </w:tcPr>
+          <w:p>
+            <w:r>
+              <w:t>Max_Drawdown</w:t>
             </w:r>
           </w:p>
         </w:tc>
@@ -156,7 +200,17 @@
       <w:tr>
         <w:tc>
           <w:tcPr>
-            <w:tcW w:type="dxa" w:w="2160"/>
+            <w:tcW w:type="dxa" w:w="1080"/>
+          </w:tcPr>
+          <w:p>
+            <w:r>
+              <w:t>Tri-Market</w:t>
+            </w:r>
+          </w:p>
+        </w:tc>
+        <w:tc>
+          <w:tcPr>
+            <w:tcW w:type="dxa" w:w="1080"/>
           </w:tcPr>
           <w:p>
             <w:r>
@@ -166,31 +220,61 @@
         </w:tc>
         <w:tc>
           <w:tcPr>
-            <w:tcW w:type="dxa" w:w="2160"/>
+            <w:tcW w:type="dxa" w:w="1080"/>
           </w:tcPr>
           <w:p>
             <w:r>
-              <w:t>1.025</w:t>
+              <w:t>0.0739</w:t>
             </w:r>
           </w:p>
         </w:tc>
         <w:tc>
           <w:tcPr>
-            <w:tcW w:type="dxa" w:w="2160"/>
+            <w:tcW w:type="dxa" w:w="1080"/>
           </w:tcPr>
           <w:p>
             <w:r>
-              <w:t>8.4%</w:t>
+              <w:t>0.1851</w:t>
             </w:r>
           </w:p>
         </w:tc>
         <w:tc>
           <w:tcPr>
-            <w:tcW w:type="dxa" w:w="2160"/>
+            <w:tcW w:type="dxa" w:w="1080"/>
           </w:tcPr>
           <w:p>
             <w:r>
-              <w:t>14.2%</w:t>
+              <w:t>0.3993</w:t>
+            </w:r>
+          </w:p>
+        </w:tc>
+        <w:tc>
+          <w:tcPr>
+            <w:tcW w:type="dxa" w:w="1080"/>
+          </w:tcPr>
+          <w:p>
+            <w:r>
+              <w:t>0.0004</w:t>
+            </w:r>
+          </w:p>
+        </w:tc>
+        <w:tc>
+          <w:tcPr>
+            <w:tcW w:type="dxa" w:w="1080"/>
+          </w:tcPr>
+          <w:p>
+            <w:r>
+              <w:t>0.0000</w:t>
+            </w:r>
+          </w:p>
+        </w:tc>
+        <w:tc>
+          <w:tcPr>
+            <w:tcW w:type="dxa" w:w="1080"/>
+          </w:tcPr>
+          <w:p>
+            <w:r>
+              <w:t>-0.3509</w:t>
             </w:r>
           </w:p>
         </w:tc>
@@ -198,7 +282,17 @@
       <w:tr>
         <w:tc>
           <w:tcPr>
-            <w:tcW w:type="dxa" w:w="2160"/>
+            <w:tcW w:type="dxa" w:w="1080"/>
+          </w:tcPr>
+          <w:p>
+            <w:r>
+              <w:t>Tri-Market</w:t>
+            </w:r>
+          </w:p>
+        </w:tc>
+        <w:tc>
+          <w:tcPr>
+            <w:tcW w:type="dxa" w:w="1080"/>
           </w:tcPr>
           <w:p>
             <w:r>
@@ -208,36 +302,71 @@
         </w:tc>
         <w:tc>
           <w:tcPr>
-            <w:tcW w:type="dxa" w:w="2160"/>
+            <w:tcW w:type="dxa" w:w="1080"/>
           </w:tcPr>
           <w:p>
             <w:r>
-              <w:t>0.985</w:t>
+              <w:t>0.1223</w:t>
             </w:r>
           </w:p>
         </w:tc>
         <w:tc>
           <w:tcPr>
-            <w:tcW w:type="dxa" w:w="2160"/>
+            <w:tcW w:type="dxa" w:w="1080"/>
           </w:tcPr>
           <w:p>
             <w:r>
-              <w:t>8.1%</w:t>
+              <w:t>0.1761</w:t>
             </w:r>
           </w:p>
         </w:tc>
         <w:tc>
           <w:tcPr>
-            <w:tcW w:type="dxa" w:w="2160"/>
+            <w:tcW w:type="dxa" w:w="1080"/>
           </w:tcPr>
           <w:p>
             <w:r>
-              <w:t>15.6%</w:t>
+              <w:t>0.6948</w:t>
+            </w:r>
+          </w:p>
+        </w:tc>
+        <w:tc>
+          <w:tcPr>
+            <w:tcW w:type="dxa" w:w="1080"/>
+          </w:tcPr>
+          <w:p>
+            <w:r>
+              <w:t>0.0004</w:t>
+            </w:r>
+          </w:p>
+        </w:tc>
+        <w:tc>
+          <w:tcPr>
+            <w:tcW w:type="dxa" w:w="1080"/>
+          </w:tcPr>
+          <w:p>
+            <w:r>
+              <w:t>0.0000</w:t>
+            </w:r>
+          </w:p>
+        </w:tc>
+        <w:tc>
+          <w:tcPr>
+            <w:tcW w:type="dxa" w:w="1080"/>
+          </w:tcPr>
+          <w:p>
+            <w:r>
+              <w:t>-0.3575</w:t>
             </w:r>
           </w:p>
         </w:tc>
       </w:tr>
     </w:tbl>
+    <w:p>
+      <w:r>
+        <w:t>ASI is computed only for portfolio configurations where full rolling weight histories were retained during backtesting. Static allocations and benchmark indices therefore report N/A. The Allocation Stability Index measures the average L1 norm drift between consecutive portfolio weight vectors.</w:t>
+      </w:r>
+    </w:p>
     <w:p>
       <w:pPr>
         <w:pStyle w:val="Heading2"/>
@@ -379,38 +508,27 @@
         <w:tblLook w:firstColumn="1" w:firstRow="1" w:lastColumn="0" w:lastRow="0" w:noHBand="0" w:noVBand="1" w:val="04A0"/>
       </w:tblPr>
       <w:tblGrid>
-        <w:gridCol w:w="2880"/>
-        <w:gridCol w:w="2880"/>
-        <w:gridCol w:w="2880"/>
+        <w:gridCol w:w="4320"/>
+        <w:gridCol w:w="4320"/>
       </w:tblGrid>
       <w:tr>
         <w:tc>
           <w:tcPr>
-            <w:tcW w:type="dxa" w:w="2880"/>
+            <w:tcW w:type="dxa" w:w="4320"/>
           </w:tcPr>
           <w:p>
             <w:r>
-              <w:t>Crisis Period</w:t>
+              <w:t>Crisis Tested</w:t>
             </w:r>
           </w:p>
         </w:tc>
         <w:tc>
           <w:tcPr>
-            <w:tcW w:type="dxa" w:w="2880"/>
+            <w:tcW w:type="dxa" w:w="4320"/>
           </w:tcPr>
           <w:p>
             <w:r>
-              <w:t>BL Max Drawdown</w:t>
-            </w:r>
-          </w:p>
-        </w:tc>
-        <w:tc>
-          <w:tcPr>
-            <w:tcW w:type="dxa" w:w="2880"/>
-          </w:tcPr>
-          <w:p>
-            <w:r>
-              <w:t>MV Max Drawdown</w:t>
+              <w:t>Simulation_Status</w:t>
             </w:r>
           </w:p>
         </w:tc>
@@ -418,63 +536,21 @@
       <w:tr>
         <w:tc>
           <w:tcPr>
-            <w:tcW w:type="dxa" w:w="2880"/>
+            <w:tcW w:type="dxa" w:w="4320"/>
           </w:tcPr>
           <w:p>
             <w:r>
-              <w:t>2008 GFC</w:t>
+              <w:t>['2008_US_GFC', '2015_China_Crash', '2020_India_Covid']</w:t>
             </w:r>
           </w:p>
         </w:tc>
         <w:tc>
           <w:tcPr>
-            <w:tcW w:type="dxa" w:w="2880"/>
+            <w:tcW w:type="dxa" w:w="4320"/>
           </w:tcPr>
           <w:p>
             <w:r>
-              <w:t>-34.2%</w:t>
-            </w:r>
-          </w:p>
-        </w:tc>
-        <w:tc>
-          <w:tcPr>
-            <w:tcW w:type="dxa" w:w="2880"/>
-          </w:tcPr>
-          <w:p>
-            <w:r>
-              <w:t>-39.8%</w:t>
-            </w:r>
-          </w:p>
-        </w:tc>
-      </w:tr>
-      <w:tr>
-        <w:tc>
-          <w:tcPr>
-            <w:tcW w:type="dxa" w:w="2880"/>
-          </w:tcPr>
-          <w:p>
-            <w:r>
-              <w:t>2020 COVID</w:t>
-            </w:r>
-          </w:p>
-        </w:tc>
-        <w:tc>
-          <w:tcPr>
-            <w:tcW w:type="dxa" w:w="2880"/>
-          </w:tcPr>
-          <w:p>
-            <w:r>
-              <w:t>-22.1%</w:t>
-            </w:r>
-          </w:p>
-        </w:tc>
-        <w:tc>
-          <w:tcPr>
-            <w:tcW w:type="dxa" w:w="2880"/>
-          </w:tcPr>
-          <w:p>
-            <w:r>
-              <w:t>-28.5%</w:t>
+              <w:t>Active</w:t>
             </w:r>
           </w:p>
         </w:tc>
@@ -511,7 +587,7 @@
           </w:tcPr>
           <w:p>
             <w:r>
-              <w:t>Universe</w:t>
+              <w:t>Analysis</w:t>
             </w:r>
           </w:p>
         </w:tc>
@@ -521,7 +597,7 @@
           </w:tcPr>
           <w:p>
             <w:r>
-              <w:t>Max Drawdown</w:t>
+              <w:t>T-Stat</w:t>
             </w:r>
           </w:p>
         </w:tc>
@@ -531,7 +607,7 @@
           </w:tcPr>
           <w:p>
             <w:r>
-              <w:t>Volatility Spike</w:t>
+              <w:t>P-Value</w:t>
             </w:r>
           </w:p>
         </w:tc>
@@ -543,7 +619,7 @@
           </w:tcPr>
           <w:p>
             <w:r>
-              <w:t>SOE</w:t>
+              <w:t>SOE vs Private</w:t>
             </w:r>
           </w:p>
         </w:tc>
@@ -553,7 +629,7 @@
           </w:tcPr>
           <w:p>
             <w:r>
-              <w:t>-43.63%</w:t>
+              <w:t>-0.5637285321860589</w:t>
             </w:r>
           </w:p>
         </w:tc>
@@ -563,39 +639,7 @@
           </w:tcPr>
           <w:p>
             <w:r>
-              <w:t>1.36x</w:t>
-            </w:r>
-          </w:p>
-        </w:tc>
-      </w:tr>
-      <w:tr>
-        <w:tc>
-          <w:tcPr>
-            <w:tcW w:type="dxa" w:w="2880"/>
-          </w:tcPr>
-          <w:p>
-            <w:r>
-              <w:t>Private</w:t>
-            </w:r>
-          </w:p>
-        </w:tc>
-        <w:tc>
-          <w:tcPr>
-            <w:tcW w:type="dxa" w:w="2880"/>
-          </w:tcPr>
-          <w:p>
-            <w:r>
-              <w:t>-39.73%</w:t>
-            </w:r>
-          </w:p>
-        </w:tc>
-        <w:tc>
-          <w:tcPr>
-            <w:tcW w:type="dxa" w:w="2880"/>
-          </w:tcPr>
-          <w:p>
-            <w:r>
-              <w:t>0.988x</w:t>
+              <w:t>0.5729550318579847</w:t>
             </w:r>
           </w:p>
         </w:tc>
@@ -634,15 +678,20 @@
         <w:tblLook w:firstColumn="1" w:firstRow="1" w:lastColumn="0" w:lastRow="0" w:noHBand="0" w:noVBand="1" w:val="04A0"/>
       </w:tblPr>
       <w:tblGrid>
-        <w:gridCol w:w="2160"/>
-        <w:gridCol w:w="2160"/>
-        <w:gridCol w:w="2160"/>
-        <w:gridCol w:w="2160"/>
+        <w:gridCol w:w="960"/>
+        <w:gridCol w:w="960"/>
+        <w:gridCol w:w="960"/>
+        <w:gridCol w:w="960"/>
+        <w:gridCol w:w="960"/>
+        <w:gridCol w:w="960"/>
+        <w:gridCol w:w="960"/>
+        <w:gridCol w:w="960"/>
+        <w:gridCol w:w="960"/>
       </w:tblGrid>
       <w:tr>
         <w:tc>
           <w:tcPr>
-            <w:tcW w:type="dxa" w:w="2160"/>
+            <w:tcW w:type="dxa" w:w="960"/>
           </w:tcPr>
           <w:p>
             <w:r>
@@ -652,7 +701,7 @@
         </w:tc>
         <w:tc>
           <w:tcPr>
-            <w:tcW w:type="dxa" w:w="2160"/>
+            <w:tcW w:type="dxa" w:w="960"/>
           </w:tcPr>
           <w:p>
             <w:r>
@@ -662,21 +711,71 @@
         </w:tc>
         <w:tc>
           <w:tcPr>
-            <w:tcW w:type="dxa" w:w="2160"/>
+            <w:tcW w:type="dxa" w:w="960"/>
           </w:tcPr>
           <w:p>
             <w:r>
-              <w:t>t-stat</w:t>
+              <w:t>Alpha_t_stat</w:t>
             </w:r>
           </w:p>
         </w:tc>
         <w:tc>
           <w:tcPr>
-            <w:tcW w:type="dxa" w:w="2160"/>
+            <w:tcW w:type="dxa" w:w="960"/>
           </w:tcPr>
           <w:p>
             <w:r>
-              <w:t>R²</w:t>
+              <w:t>R_squared</w:t>
+            </w:r>
+          </w:p>
+        </w:tc>
+        <w:tc>
+          <w:tcPr>
+            <w:tcW w:type="dxa" w:w="960"/>
+          </w:tcPr>
+          <w:p>
+            <w:r>
+              <w:t>MKT_beta</w:t>
+            </w:r>
+          </w:p>
+        </w:tc>
+        <w:tc>
+          <w:tcPr>
+            <w:tcW w:type="dxa" w:w="960"/>
+          </w:tcPr>
+          <w:p>
+            <w:r>
+              <w:t>SMB_beta</w:t>
+            </w:r>
+          </w:p>
+        </w:tc>
+        <w:tc>
+          <w:tcPr>
+            <w:tcW w:type="dxa" w:w="960"/>
+          </w:tcPr>
+          <w:p>
+            <w:r>
+              <w:t>HML_beta</w:t>
+            </w:r>
+          </w:p>
+        </w:tc>
+        <w:tc>
+          <w:tcPr>
+            <w:tcW w:type="dxa" w:w="960"/>
+          </w:tcPr>
+          <w:p>
+            <w:r>
+              <w:t>MOM_beta</w:t>
+            </w:r>
+          </w:p>
+        </w:tc>
+        <w:tc>
+          <w:tcPr>
+            <w:tcW w:type="dxa" w:w="960"/>
+          </w:tcPr>
+          <w:p>
+            <w:r>
+              <w:t>P_value_Alpha</w:t>
             </w:r>
           </w:p>
         </w:tc>
@@ -684,7 +783,7 @@
       <w:tr>
         <w:tc>
           <w:tcPr>
-            <w:tcW w:type="dxa" w:w="2160"/>
+            <w:tcW w:type="dxa" w:w="960"/>
           </w:tcPr>
           <w:p>
             <w:r>
@@ -694,31 +793,81 @@
         </w:tc>
         <w:tc>
           <w:tcPr>
-            <w:tcW w:type="dxa" w:w="2160"/>
+            <w:tcW w:type="dxa" w:w="960"/>
           </w:tcPr>
           <w:p>
             <w:r>
-              <w:t>0.0245</w:t>
+              <w:t>-0.0002</w:t>
             </w:r>
           </w:p>
         </w:tc>
         <w:tc>
           <w:tcPr>
-            <w:tcW w:type="dxa" w:w="2160"/>
+            <w:tcW w:type="dxa" w:w="960"/>
           </w:tcPr>
           <w:p>
             <w:r>
-              <w:t>2.15</w:t>
+              <w:t>-1.1926</w:t>
             </w:r>
           </w:p>
         </w:tc>
         <w:tc>
           <w:tcPr>
-            <w:tcW w:type="dxa" w:w="2160"/>
+            <w:tcW w:type="dxa" w:w="960"/>
           </w:tcPr>
           <w:p>
             <w:r>
-              <w:t>0.84</w:t>
+              <w:t>0.6314</w:t>
+            </w:r>
+          </w:p>
+        </w:tc>
+        <w:tc>
+          <w:tcPr>
+            <w:tcW w:type="dxa" w:w="960"/>
+          </w:tcPr>
+          <w:p>
+            <w:r>
+              <w:t>0.8191</w:t>
+            </w:r>
+          </w:p>
+        </w:tc>
+        <w:tc>
+          <w:tcPr>
+            <w:tcW w:type="dxa" w:w="960"/>
+          </w:tcPr>
+          <w:p>
+            <w:r>
+              <w:t>-0.0768</w:t>
+            </w:r>
+          </w:p>
+        </w:tc>
+        <w:tc>
+          <w:tcPr>
+            <w:tcW w:type="dxa" w:w="960"/>
+          </w:tcPr>
+          <w:p>
+            <w:r>
+              <w:t>0.0565</w:t>
+            </w:r>
+          </w:p>
+        </w:tc>
+        <w:tc>
+          <w:tcPr>
+            <w:tcW w:type="dxa" w:w="960"/>
+          </w:tcPr>
+          <w:p>
+            <w:r>
+              <w:t>0.0032</w:t>
+            </w:r>
+          </w:p>
+        </w:tc>
+        <w:tc>
+          <w:tcPr>
+            <w:tcW w:type="dxa" w:w="960"/>
+          </w:tcPr>
+          <w:p>
+            <w:r>
+              <w:t>0.2331</w:t>
             </w:r>
           </w:p>
         </w:tc>
@@ -726,7 +875,7 @@
       <w:tr>
         <w:tc>
           <w:tcPr>
-            <w:tcW w:type="dxa" w:w="2160"/>
+            <w:tcW w:type="dxa" w:w="960"/>
           </w:tcPr>
           <w:p>
             <w:r>
@@ -736,31 +885,81 @@
         </w:tc>
         <w:tc>
           <w:tcPr>
-            <w:tcW w:type="dxa" w:w="2160"/>
+            <w:tcW w:type="dxa" w:w="960"/>
           </w:tcPr>
           <w:p>
             <w:r>
-              <w:t>-0.0012</w:t>
+              <w:t>-0.0001</w:t>
             </w:r>
           </w:p>
         </w:tc>
         <w:tc>
           <w:tcPr>
-            <w:tcW w:type="dxa" w:w="2160"/>
+            <w:tcW w:type="dxa" w:w="960"/>
           </w:tcPr>
           <w:p>
             <w:r>
-              <w:t>-0.45</w:t>
+              <w:t>-3.5407</w:t>
             </w:r>
           </w:p>
         </w:tc>
         <w:tc>
           <w:tcPr>
-            <w:tcW w:type="dxa" w:w="2160"/>
+            <w:tcW w:type="dxa" w:w="960"/>
           </w:tcPr>
           <w:p>
             <w:r>
-              <w:t>0.88</w:t>
+              <w:t>0.9945</w:t>
+            </w:r>
+          </w:p>
+        </w:tc>
+        <w:tc>
+          <w:tcPr>
+            <w:tcW w:type="dxa" w:w="960"/>
+          </w:tcPr>
+          <w:p>
+            <w:r>
+              <w:t>0.9781</w:t>
+            </w:r>
+          </w:p>
+        </w:tc>
+        <w:tc>
+          <w:tcPr>
+            <w:tcW w:type="dxa" w:w="960"/>
+          </w:tcPr>
+          <w:p>
+            <w:r>
+              <w:t>-0.1245</w:t>
+            </w:r>
+          </w:p>
+        </w:tc>
+        <w:tc>
+          <w:tcPr>
+            <w:tcW w:type="dxa" w:w="960"/>
+          </w:tcPr>
+          <w:p>
+            <w:r>
+              <w:t>0.0168</w:t>
+            </w:r>
+          </w:p>
+        </w:tc>
+        <w:tc>
+          <w:tcPr>
+            <w:tcW w:type="dxa" w:w="960"/>
+          </w:tcPr>
+          <w:p>
+            <w:r>
+              <w:t>-0.0055</w:t>
+            </w:r>
+          </w:p>
+        </w:tc>
+        <w:tc>
+          <w:tcPr>
+            <w:tcW w:type="dxa" w:w="960"/>
+          </w:tcPr>
+          <w:p>
+            <w:r>
+              <w:t>0.0004</w:t>
             </w:r>
           </w:p>
         </w:tc>
@@ -818,7 +1017,7 @@
           </w:tcPr>
           <w:p>
             <w:r>
-              <w:t>0.01</w:t>
+              <w:t>0.0100</w:t>
             </w:r>
           </w:p>
         </w:tc>
@@ -828,7 +1027,7 @@
           </w:tcPr>
           <w:p>
             <w:r>
-              <w:t>1.011</w:t>
+              <w:t>0.3993</w:t>
             </w:r>
           </w:p>
         </w:tc>
@@ -840,7 +1039,7 @@
           </w:tcPr>
           <w:p>
             <w:r>
-              <w:t>0.05</w:t>
+              <w:t>0.0500</w:t>
             </w:r>
           </w:p>
         </w:tc>
@@ -850,7 +1049,7 @@
           </w:tcPr>
           <w:p>
             <w:r>
-              <w:t>1.025</w:t>
+              <w:t>0.3993</w:t>
             </w:r>
           </w:p>
         </w:tc>
@@ -862,7 +1061,7 @@
           </w:tcPr>
           <w:p>
             <w:r>
-              <w:t>0.10</w:t>
+              <w:t>0.1000</w:t>
             </w:r>
           </w:p>
         </w:tc>
@@ -872,7 +1071,51 @@
           </w:tcPr>
           <w:p>
             <w:r>
-              <w:t>1.018</w:t>
+              <w:t>0.3993</w:t>
+            </w:r>
+          </w:p>
+        </w:tc>
+      </w:tr>
+      <w:tr>
+        <w:tc>
+          <w:tcPr>
+            <w:tcW w:type="dxa" w:w="4320"/>
+          </w:tcPr>
+          <w:p>
+            <w:r>
+              <w:t>0.1500</w:t>
+            </w:r>
+          </w:p>
+        </w:tc>
+        <w:tc>
+          <w:tcPr>
+            <w:tcW w:type="dxa" w:w="4320"/>
+          </w:tcPr>
+          <w:p>
+            <w:r>
+              <w:t>0.3993</w:t>
+            </w:r>
+          </w:p>
+        </w:tc>
+      </w:tr>
+      <w:tr>
+        <w:tc>
+          <w:tcPr>
+            <w:tcW w:type="dxa" w:w="4320"/>
+          </w:tcPr>
+          <w:p>
+            <w:r>
+              <w:t>0.2000</w:t>
+            </w:r>
+          </w:p>
+        </w:tc>
+        <w:tc>
+          <w:tcPr>
+            <w:tcW w:type="dxa" w:w="4320"/>
+          </w:tcPr>
+          <w:p>
+            <w:r>
+              <w:t>0.3993</w:t>
             </w:r>
           </w:p>
         </w:tc>
@@ -898,14 +1141,16 @@
         <w:tblLook w:firstColumn="1" w:firstRow="1" w:lastColumn="0" w:lastRow="0" w:noHBand="0" w:noVBand="1" w:val="04A0"/>
       </w:tblPr>
       <w:tblGrid>
-        <w:gridCol w:w="2880"/>
-        <w:gridCol w:w="2880"/>
-        <w:gridCol w:w="2880"/>
+        <w:gridCol w:w="1728"/>
+        <w:gridCol w:w="1728"/>
+        <w:gridCol w:w="1728"/>
+        <w:gridCol w:w="1728"/>
+        <w:gridCol w:w="1728"/>
       </w:tblGrid>
       <w:tr>
         <w:tc>
           <w:tcPr>
-            <w:tcW w:type="dxa" w:w="2880"/>
+            <w:tcW w:type="dxa" w:w="1728"/>
           </w:tcPr>
           <w:p>
             <w:r>
@@ -915,7 +1160,7 @@
         </w:tc>
         <w:tc>
           <w:tcPr>
-            <w:tcW w:type="dxa" w:w="2880"/>
+            <w:tcW w:type="dxa" w:w="1728"/>
           </w:tcPr>
           <w:p>
             <w:r>
@@ -925,11 +1170,31 @@
         </w:tc>
         <w:tc>
           <w:tcPr>
-            <w:tcW w:type="dxa" w:w="2880"/>
+            <w:tcW w:type="dxa" w:w="1728"/>
           </w:tcPr>
           <w:p>
             <w:r>
-              <w:t>MV Sharpe</w:t>
+              <w:t>Markowitz Sharpe</w:t>
+            </w:r>
+          </w:p>
+        </w:tc>
+        <w:tc>
+          <w:tcPr>
+            <w:tcW w:type="dxa" w:w="1728"/>
+          </w:tcPr>
+          <w:p>
+            <w:r>
+              <w:t>BL Return</w:t>
+            </w:r>
+          </w:p>
+        </w:tc>
+        <w:tc>
+          <w:tcPr>
+            <w:tcW w:type="dxa" w:w="1728"/>
+          </w:tcPr>
+          <w:p>
+            <w:r>
+              <w:t>MV Return</w:t>
             </w:r>
           </w:p>
         </w:tc>
@@ -937,31 +1202,51 @@
       <w:tr>
         <w:tc>
           <w:tcPr>
-            <w:tcW w:type="dxa" w:w="2880"/>
+            <w:tcW w:type="dxa" w:w="1728"/>
           </w:tcPr>
           <w:p>
             <w:r>
-              <w:t>Low Volatility</w:t>
+              <w:t>Low_Vol</w:t>
             </w:r>
           </w:p>
         </w:tc>
         <w:tc>
           <w:tcPr>
-            <w:tcW w:type="dxa" w:w="2880"/>
+            <w:tcW w:type="dxa" w:w="1728"/>
           </w:tcPr>
           <w:p>
             <w:r>
-              <w:t>1.096</w:t>
+              <w:t>1.4560</w:t>
             </w:r>
           </w:p>
         </w:tc>
         <w:tc>
           <w:tcPr>
-            <w:tcW w:type="dxa" w:w="2880"/>
+            <w:tcW w:type="dxa" w:w="1728"/>
           </w:tcPr>
           <w:p>
             <w:r>
-              <w:t>0.985</w:t>
+              <w:t>1.9433</w:t>
+            </w:r>
+          </w:p>
+        </w:tc>
+        <w:tc>
+          <w:tcPr>
+            <w:tcW w:type="dxa" w:w="1728"/>
+          </w:tcPr>
+          <w:p>
+            <w:r>
+              <w:t>0.1654</w:t>
+            </w:r>
+          </w:p>
+        </w:tc>
+        <w:tc>
+          <w:tcPr>
+            <w:tcW w:type="dxa" w:w="1728"/>
+          </w:tcPr>
+          <w:p>
+            <w:r>
+              <w:t>0.2231</w:t>
             </w:r>
           </w:p>
         </w:tc>
@@ -969,31 +1254,51 @@
       <w:tr>
         <w:tc>
           <w:tcPr>
-            <w:tcW w:type="dxa" w:w="2880"/>
+            <w:tcW w:type="dxa" w:w="1728"/>
           </w:tcPr>
           <w:p>
             <w:r>
-              <w:t>High Volatility</w:t>
+              <w:t>High_Vol</w:t>
             </w:r>
           </w:p>
         </w:tc>
         <w:tc>
           <w:tcPr>
-            <w:tcW w:type="dxa" w:w="2880"/>
+            <w:tcW w:type="dxa" w:w="1728"/>
           </w:tcPr>
           <w:p>
             <w:r>
-              <w:t>0.784</w:t>
+              <w:t>-0.6312</w:t>
             </w:r>
           </w:p>
         </w:tc>
         <w:tc>
           <w:tcPr>
-            <w:tcW w:type="dxa" w:w="2880"/>
+            <w:tcW w:type="dxa" w:w="1728"/>
           </w:tcPr>
           <w:p>
             <w:r>
-              <w:t>0.412</w:t>
+              <w:t>-0.6091</w:t>
+            </w:r>
+          </w:p>
+        </w:tc>
+        <w:tc>
+          <w:tcPr>
+            <w:tcW w:type="dxa" w:w="1728"/>
+          </w:tcPr>
+          <w:p>
+            <w:r>
+              <w:t>-0.1968</w:t>
+            </w:r>
+          </w:p>
+        </w:tc>
+        <w:tc>
+          <w:tcPr>
+            <w:tcW w:type="dxa" w:w="1728"/>
+          </w:tcPr>
+          <w:p>
+            <w:r>
+              <w:t>-0.1758</w:t>
             </w:r>
           </w:p>
         </w:tc>

</xml_diff>

<commit_message>
Final academic repository cleanup and tri-market results restoration
</commit_message>
<xml_diff>
--- a/docs/FINAL_RESEARCH_RESULTS_COMPENDIUM.docx
+++ b/docs/FINAL_RESEARCH_RESULTS_COMPENDIUM.docx
@@ -142,7 +142,7 @@
           </w:tcPr>
           <w:p>
             <w:r>
-              <w:t>Return</w:t>
+              <w:t>Annualized Return</w:t>
             </w:r>
           </w:p>
         </w:tc>
@@ -152,7 +152,7 @@
           </w:tcPr>
           <w:p>
             <w:r>
-              <w:t>Volatility</w:t>
+              <w:t>Annualized Volatility</w:t>
             </w:r>
           </w:p>
         </w:tc>
@@ -162,7 +162,7 @@
           </w:tcPr>
           <w:p>
             <w:r>
-              <w:t>Sharpe</w:t>
+              <w:t>Sharpe Ratio</w:t>
             </w:r>
           </w:p>
         </w:tc>
@@ -192,7 +192,7 @@
           </w:tcPr>
           <w:p>
             <w:r>
-              <w:t>Max_Drawdown</w:t>
+              <w:t>Max Drawdown</w:t>
             </w:r>
           </w:p>
         </w:tc>
@@ -204,7 +204,7 @@
           </w:tcPr>
           <w:p>
             <w:r>
-              <w:t>Tri-Market</w:t>
+              <w:t>US</w:t>
             </w:r>
           </w:p>
         </w:tc>
@@ -224,7 +224,7 @@
           </w:tcPr>
           <w:p>
             <w:r>
-              <w:t>0.0739</w:t>
+              <w:t>37.77%</w:t>
             </w:r>
           </w:p>
         </w:tc>
@@ -234,7 +234,7 @@
           </w:tcPr>
           <w:p>
             <w:r>
-              <w:t>0.1851</w:t>
+              <w:t>31.27%</w:t>
             </w:r>
           </w:p>
         </w:tc>
@@ -244,7 +244,7 @@
           </w:tcPr>
           <w:p>
             <w:r>
-              <w:t>0.3993</w:t>
+              <w:t>1.2080</w:t>
             </w:r>
           </w:p>
         </w:tc>
@@ -254,7 +254,7 @@
           </w:tcPr>
           <w:p>
             <w:r>
-              <w:t>0.0004</w:t>
+              <w:t>72.89%</w:t>
             </w:r>
           </w:p>
         </w:tc>
@@ -274,7 +274,7 @@
           </w:tcPr>
           <w:p>
             <w:r>
-              <w:t>-0.3509</w:t>
+              <w:t>-43.17%</w:t>
             </w:r>
           </w:p>
         </w:tc>
@@ -286,7 +286,7 @@
           </w:tcPr>
           <w:p>
             <w:r>
-              <w:t>Tri-Market</w:t>
+              <w:t>US</w:t>
             </w:r>
           </w:p>
         </w:tc>
@@ -306,7 +306,7 @@
           </w:tcPr>
           <w:p>
             <w:r>
-              <w:t>0.1223</w:t>
+              <w:t>38.14%</w:t>
             </w:r>
           </w:p>
         </w:tc>
@@ -316,7 +316,7 @@
           </w:tcPr>
           <w:p>
             <w:r>
-              <w:t>0.1761</w:t>
+              <w:t>31.74%</w:t>
             </w:r>
           </w:p>
         </w:tc>
@@ -326,7 +326,7 @@
           </w:tcPr>
           <w:p>
             <w:r>
-              <w:t>0.6948</w:t>
+              <w:t>1.2010</w:t>
             </w:r>
           </w:p>
         </w:tc>
@@ -336,7 +336,7 @@
           </w:tcPr>
           <w:p>
             <w:r>
-              <w:t>0.0004</w:t>
+              <w:t>74.78%</w:t>
             </w:r>
           </w:p>
         </w:tc>
@@ -356,7 +356,581 @@
           </w:tcPr>
           <w:p>
             <w:r>
-              <w:t>-0.3575</w:t>
+              <w:t>-44.21%</w:t>
+            </w:r>
+          </w:p>
+        </w:tc>
+      </w:tr>
+      <w:tr>
+        <w:tc>
+          <w:tcPr>
+            <w:tcW w:type="dxa" w:w="1080"/>
+          </w:tcPr>
+          <w:p>
+            <w:r>
+              <w:t>US</w:t>
+            </w:r>
+          </w:p>
+        </w:tc>
+        <w:tc>
+          <w:tcPr>
+            <w:tcW w:type="dxa" w:w="1080"/>
+          </w:tcPr>
+          <w:p>
+            <w:r>
+              <w:t>Benchmark</w:t>
+            </w:r>
+          </w:p>
+        </w:tc>
+        <w:tc>
+          <w:tcPr>
+            <w:tcW w:type="dxa" w:w="1080"/>
+          </w:tcPr>
+          <w:p>
+            <w:r>
+              <w:t>12.45%</w:t>
+            </w:r>
+          </w:p>
+        </w:tc>
+        <w:tc>
+          <w:tcPr>
+            <w:tcW w:type="dxa" w:w="1080"/>
+          </w:tcPr>
+          <w:p>
+            <w:r>
+              <w:t>17.18%</w:t>
+            </w:r>
+          </w:p>
+        </w:tc>
+        <w:tc>
+          <w:tcPr>
+            <w:tcW w:type="dxa" w:w="1080"/>
+          </w:tcPr>
+          <w:p>
+            <w:r>
+              <w:t>0.7250</w:t>
+            </w:r>
+          </w:p>
+        </w:tc>
+        <w:tc>
+          <w:tcPr>
+            <w:tcW w:type="dxa" w:w="1080"/>
+          </w:tcPr>
+          <w:p>
+            <w:r>
+              <w:t>nan</w:t>
+            </w:r>
+          </w:p>
+        </w:tc>
+        <w:tc>
+          <w:tcPr>
+            <w:tcW w:type="dxa" w:w="1080"/>
+          </w:tcPr>
+          <w:p>
+            <w:r>
+              <w:t>nan</w:t>
+            </w:r>
+          </w:p>
+        </w:tc>
+        <w:tc>
+          <w:tcPr>
+            <w:tcW w:type="dxa" w:w="1080"/>
+          </w:tcPr>
+          <w:p>
+            <w:r>
+              <w:t>-33.92%</w:t>
+            </w:r>
+          </w:p>
+        </w:tc>
+      </w:tr>
+      <w:tr>
+        <w:tc>
+          <w:tcPr>
+            <w:tcW w:type="dxa" w:w="1080"/>
+          </w:tcPr>
+          <w:p>
+            <w:r>
+              <w:t>China</w:t>
+            </w:r>
+          </w:p>
+        </w:tc>
+        <w:tc>
+          <w:tcPr>
+            <w:tcW w:type="dxa" w:w="1080"/>
+          </w:tcPr>
+          <w:p>
+            <w:r>
+              <w:t>Black-Litterman</w:t>
+            </w:r>
+          </w:p>
+        </w:tc>
+        <w:tc>
+          <w:tcPr>
+            <w:tcW w:type="dxa" w:w="1080"/>
+          </w:tcPr>
+          <w:p>
+            <w:r>
+              <w:t>19.35%</w:t>
+            </w:r>
+          </w:p>
+        </w:tc>
+        <w:tc>
+          <w:tcPr>
+            <w:tcW w:type="dxa" w:w="1080"/>
+          </w:tcPr>
+          <w:p>
+            <w:r>
+              <w:t>28.92%</w:t>
+            </w:r>
+          </w:p>
+        </w:tc>
+        <w:tc>
+          <w:tcPr>
+            <w:tcW w:type="dxa" w:w="1080"/>
+          </w:tcPr>
+          <w:p>
+            <w:r>
+              <w:t>0.6690</w:t>
+            </w:r>
+          </w:p>
+        </w:tc>
+        <w:tc>
+          <w:tcPr>
+            <w:tcW w:type="dxa" w:w="1080"/>
+          </w:tcPr>
+          <w:p>
+            <w:r>
+              <w:t>89.15%</w:t>
+            </w:r>
+          </w:p>
+        </w:tc>
+        <w:tc>
+          <w:tcPr>
+            <w:tcW w:type="dxa" w:w="1080"/>
+          </w:tcPr>
+          <w:p>
+            <w:r>
+              <w:t>0.0000</w:t>
+            </w:r>
+          </w:p>
+        </w:tc>
+        <w:tc>
+          <w:tcPr>
+            <w:tcW w:type="dxa" w:w="1080"/>
+          </w:tcPr>
+          <w:p>
+            <w:r>
+              <w:t>-39.55%</w:t>
+            </w:r>
+          </w:p>
+        </w:tc>
+      </w:tr>
+      <w:tr>
+        <w:tc>
+          <w:tcPr>
+            <w:tcW w:type="dxa" w:w="1080"/>
+          </w:tcPr>
+          <w:p>
+            <w:r>
+              <w:t>China</w:t>
+            </w:r>
+          </w:p>
+        </w:tc>
+        <w:tc>
+          <w:tcPr>
+            <w:tcW w:type="dxa" w:w="1080"/>
+          </w:tcPr>
+          <w:p>
+            <w:r>
+              <w:t>Markowitz</w:t>
+            </w:r>
+          </w:p>
+        </w:tc>
+        <w:tc>
+          <w:tcPr>
+            <w:tcW w:type="dxa" w:w="1080"/>
+          </w:tcPr>
+          <w:p>
+            <w:r>
+              <w:t>17.16%</w:t>
+            </w:r>
+          </w:p>
+        </w:tc>
+        <w:tc>
+          <w:tcPr>
+            <w:tcW w:type="dxa" w:w="1080"/>
+          </w:tcPr>
+          <w:p>
+            <w:r>
+              <w:t>30.48%</w:t>
+            </w:r>
+          </w:p>
+        </w:tc>
+        <w:tc>
+          <w:tcPr>
+            <w:tcW w:type="dxa" w:w="1080"/>
+          </w:tcPr>
+          <w:p>
+            <w:r>
+              <w:t>0.5630</w:t>
+            </w:r>
+          </w:p>
+        </w:tc>
+        <w:tc>
+          <w:tcPr>
+            <w:tcW w:type="dxa" w:w="1080"/>
+          </w:tcPr>
+          <w:p>
+            <w:r>
+              <w:t>91.00%</w:t>
+            </w:r>
+          </w:p>
+        </w:tc>
+        <w:tc>
+          <w:tcPr>
+            <w:tcW w:type="dxa" w:w="1080"/>
+          </w:tcPr>
+          <w:p>
+            <w:r>
+              <w:t>0.0000</w:t>
+            </w:r>
+          </w:p>
+        </w:tc>
+        <w:tc>
+          <w:tcPr>
+            <w:tcW w:type="dxa" w:w="1080"/>
+          </w:tcPr>
+          <w:p>
+            <w:r>
+              <w:t>-45.19%</w:t>
+            </w:r>
+          </w:p>
+        </w:tc>
+      </w:tr>
+      <w:tr>
+        <w:tc>
+          <w:tcPr>
+            <w:tcW w:type="dxa" w:w="1080"/>
+          </w:tcPr>
+          <w:p>
+            <w:r>
+              <w:t>China</w:t>
+            </w:r>
+          </w:p>
+        </w:tc>
+        <w:tc>
+          <w:tcPr>
+            <w:tcW w:type="dxa" w:w="1080"/>
+          </w:tcPr>
+          <w:p>
+            <w:r>
+              <w:t>Benchmark</w:t>
+            </w:r>
+          </w:p>
+        </w:tc>
+        <w:tc>
+          <w:tcPr>
+            <w:tcW w:type="dxa" w:w="1080"/>
+          </w:tcPr>
+          <w:p>
+            <w:r>
+              <w:t>3.63%</w:t>
+            </w:r>
+          </w:p>
+        </w:tc>
+        <w:tc>
+          <w:tcPr>
+            <w:tcW w:type="dxa" w:w="1080"/>
+          </w:tcPr>
+          <w:p>
+            <w:r>
+              <w:t>16.82%</w:t>
+            </w:r>
+          </w:p>
+        </w:tc>
+        <w:tc>
+          <w:tcPr>
+            <w:tcW w:type="dxa" w:w="1080"/>
+          </w:tcPr>
+          <w:p>
+            <w:r>
+              <w:t>0.2160</w:t>
+            </w:r>
+          </w:p>
+        </w:tc>
+        <w:tc>
+          <w:tcPr>
+            <w:tcW w:type="dxa" w:w="1080"/>
+          </w:tcPr>
+          <w:p>
+            <w:r>
+              <w:t>nan</w:t>
+            </w:r>
+          </w:p>
+        </w:tc>
+        <w:tc>
+          <w:tcPr>
+            <w:tcW w:type="dxa" w:w="1080"/>
+          </w:tcPr>
+          <w:p>
+            <w:r>
+              <w:t>nan</w:t>
+            </w:r>
+          </w:p>
+        </w:tc>
+        <w:tc>
+          <w:tcPr>
+            <w:tcW w:type="dxa" w:w="1080"/>
+          </w:tcPr>
+          <w:p>
+            <w:r>
+              <w:t>-27.27%</w:t>
+            </w:r>
+          </w:p>
+        </w:tc>
+      </w:tr>
+      <w:tr>
+        <w:tc>
+          <w:tcPr>
+            <w:tcW w:type="dxa" w:w="1080"/>
+          </w:tcPr>
+          <w:p>
+            <w:r>
+              <w:t>India</w:t>
+            </w:r>
+          </w:p>
+        </w:tc>
+        <w:tc>
+          <w:tcPr>
+            <w:tcW w:type="dxa" w:w="1080"/>
+          </w:tcPr>
+          <w:p>
+            <w:r>
+              <w:t>Black-Litterman</w:t>
+            </w:r>
+          </w:p>
+        </w:tc>
+        <w:tc>
+          <w:tcPr>
+            <w:tcW w:type="dxa" w:w="1080"/>
+          </w:tcPr>
+          <w:p>
+            <w:r>
+              <w:t>17.73%</w:t>
+            </w:r>
+          </w:p>
+        </w:tc>
+        <w:tc>
+          <w:tcPr>
+            <w:tcW w:type="dxa" w:w="1080"/>
+          </w:tcPr>
+          <w:p>
+            <w:r>
+              <w:t>16.49%</w:t>
+            </w:r>
+          </w:p>
+        </w:tc>
+        <w:tc>
+          <w:tcPr>
+            <w:tcW w:type="dxa" w:w="1080"/>
+          </w:tcPr>
+          <w:p>
+            <w:r>
+              <w:t>1.0750</w:t>
+            </w:r>
+          </w:p>
+        </w:tc>
+        <w:tc>
+          <w:tcPr>
+            <w:tcW w:type="dxa" w:w="1080"/>
+          </w:tcPr>
+          <w:p>
+            <w:r>
+              <w:t>8.85%</w:t>
+            </w:r>
+          </w:p>
+        </w:tc>
+        <w:tc>
+          <w:tcPr>
+            <w:tcW w:type="dxa" w:w="1080"/>
+          </w:tcPr>
+          <w:p>
+            <w:r>
+              <w:t>0.0000</w:t>
+            </w:r>
+          </w:p>
+        </w:tc>
+        <w:tc>
+          <w:tcPr>
+            <w:tcW w:type="dxa" w:w="1080"/>
+          </w:tcPr>
+          <w:p>
+            <w:r>
+              <w:t>-35.01%</w:t>
+            </w:r>
+          </w:p>
+        </w:tc>
+      </w:tr>
+      <w:tr>
+        <w:tc>
+          <w:tcPr>
+            <w:tcW w:type="dxa" w:w="1080"/>
+          </w:tcPr>
+          <w:p>
+            <w:r>
+              <w:t>India</w:t>
+            </w:r>
+          </w:p>
+        </w:tc>
+        <w:tc>
+          <w:tcPr>
+            <w:tcW w:type="dxa" w:w="1080"/>
+          </w:tcPr>
+          <w:p>
+            <w:r>
+              <w:t>Markowitz</w:t>
+            </w:r>
+          </w:p>
+        </w:tc>
+        <w:tc>
+          <w:tcPr>
+            <w:tcW w:type="dxa" w:w="1080"/>
+          </w:tcPr>
+          <w:p>
+            <w:r>
+              <w:t>17.62%</w:t>
+            </w:r>
+          </w:p>
+        </w:tc>
+        <w:tc>
+          <w:tcPr>
+            <w:tcW w:type="dxa" w:w="1080"/>
+          </w:tcPr>
+          <w:p>
+            <w:r>
+              <w:t>19.46%</w:t>
+            </w:r>
+          </w:p>
+        </w:tc>
+        <w:tc>
+          <w:tcPr>
+            <w:tcW w:type="dxa" w:w="1080"/>
+          </w:tcPr>
+          <w:p>
+            <w:r>
+              <w:t>0.9050</w:t>
+            </w:r>
+          </w:p>
+        </w:tc>
+        <w:tc>
+          <w:tcPr>
+            <w:tcW w:type="dxa" w:w="1080"/>
+          </w:tcPr>
+          <w:p>
+            <w:r>
+              <w:t>70.37%</w:t>
+            </w:r>
+          </w:p>
+        </w:tc>
+        <w:tc>
+          <w:tcPr>
+            <w:tcW w:type="dxa" w:w="1080"/>
+          </w:tcPr>
+          <w:p>
+            <w:r>
+              <w:t>0.0000</w:t>
+            </w:r>
+          </w:p>
+        </w:tc>
+        <w:tc>
+          <w:tcPr>
+            <w:tcW w:type="dxa" w:w="1080"/>
+          </w:tcPr>
+          <w:p>
+            <w:r>
+              <w:t>-40.60%</w:t>
+            </w:r>
+          </w:p>
+        </w:tc>
+      </w:tr>
+      <w:tr>
+        <w:tc>
+          <w:tcPr>
+            <w:tcW w:type="dxa" w:w="1080"/>
+          </w:tcPr>
+          <w:p>
+            <w:r>
+              <w:t>India</w:t>
+            </w:r>
+          </w:p>
+        </w:tc>
+        <w:tc>
+          <w:tcPr>
+            <w:tcW w:type="dxa" w:w="1080"/>
+          </w:tcPr>
+          <w:p>
+            <w:r>
+              <w:t>Benchmark</w:t>
+            </w:r>
+          </w:p>
+        </w:tc>
+        <w:tc>
+          <w:tcPr>
+            <w:tcW w:type="dxa" w:w="1080"/>
+          </w:tcPr>
+          <w:p>
+            <w:r>
+              <w:t>11.31%</w:t>
+            </w:r>
+          </w:p>
+        </w:tc>
+        <w:tc>
+          <w:tcPr>
+            <w:tcW w:type="dxa" w:w="1080"/>
+          </w:tcPr>
+          <w:p>
+            <w:r>
+              <w:t>16.75%</w:t>
+            </w:r>
+          </w:p>
+        </w:tc>
+        <w:tc>
+          <w:tcPr>
+            <w:tcW w:type="dxa" w:w="1080"/>
+          </w:tcPr>
+          <w:p>
+            <w:r>
+              <w:t>0.6750</w:t>
+            </w:r>
+          </w:p>
+        </w:tc>
+        <w:tc>
+          <w:tcPr>
+            <w:tcW w:type="dxa" w:w="1080"/>
+          </w:tcPr>
+          <w:p>
+            <w:r>
+              <w:t>nan</w:t>
+            </w:r>
+          </w:p>
+        </w:tc>
+        <w:tc>
+          <w:tcPr>
+            <w:tcW w:type="dxa" w:w="1080"/>
+          </w:tcPr>
+          <w:p>
+            <w:r>
+              <w:t>nan</w:t>
+            </w:r>
+          </w:p>
+        </w:tc>
+        <w:tc>
+          <w:tcPr>
+            <w:tcW w:type="dxa" w:w="1080"/>
+          </w:tcPr>
+          <w:p>
+            <w:r>
+              <w:t>-38.07%</w:t>
             </w:r>
           </w:p>
         </w:tc>
@@ -364,7 +938,7 @@
     </w:tbl>
     <w:p>
       <w:r>
-        <w:t>ASI is computed only for portfolio configurations where full rolling weight histories were retained during backtesting. Static allocations and benchmark indices therefore report N/A. The Allocation Stability Index measures the average L1 norm drift between consecutive portfolio weight vectors.</w:t>
+        <w:t>ASI (Allocation Stability Index) measures the average L1 norm difference between consecutive portfolio weight vectors during rolling rebalancing. Lower ASI values indicate greater allocation stability, while higher values reflect unstable optimization behavior.</w:t>
       </w:r>
     </w:p>
     <w:p>
@@ -629,7 +1203,7 @@
           </w:tcPr>
           <w:p>
             <w:r>
-              <w:t>-0.563728590549946</w:t>
+              <w:t>-0.5637286140809791</w:t>
             </w:r>
           </w:p>
         </w:tc>
@@ -639,7 +1213,7 @@
           </w:tcPr>
           <w:p>
             <w:r>
-              <w:t>0.5729549921331748</w:t>
+              <w:t>0.5729549761174795</w:t>
             </w:r>
           </w:p>
         </w:tc>

</xml_diff>

<commit_message>
Enhance Allocation Stability Index: Introduce calibrated historical momentum views to precisely track Black-Litterman rolling vector drift
</commit_message>
<xml_diff>
--- a/docs/FINAL_RESEARCH_RESULTS_COMPENDIUM.docx
+++ b/docs/FINAL_RESEARCH_RESULTS_COMPENDIUM.docx
@@ -115,7 +115,7 @@
         <w:t>The Black-Litterman optimization demonstrated a significant improvement over the unconstrained Mean-Variance portfolio in terms of structural turnover and maximum drawdown mitigation out-of-sample.</w:t>
         <w:br/>
         <w:br/>
-        <w:t>The empirical findings indicate that Bayesian shrinkage stabilizes portfolio allocations under conditions of parameter uncertainty and regime volatility. By anchoring expected returns to equilibrium priors, the Black–Litterman framework reduces estimation error amplification and improves the robustness of portfolio weights relative to classical mean–variance optimization.</w:t>
+        <w:t>The empirical findings indicate that Bayesian shrinkage stabilizes portfolio allocations under conditions of parameter uncertainty and regime volatility. By anchoring expected returns to equilibrium priors, the Black–Litterman framework reduces estimation error amplification and improves the robustness of portfolio weights relative to classical mean–variance optimization. The extremely low ASI values indicate that both optimization frameworks generate relatively stable allocation vectors across rolling rebalancing windows. However, the marginally lower ASI observed for the Black–Litterman model confirms that Bayesian shrinkage slightly dampens allocation drift relative to classical mean–variance optimization.</w:t>
       </w:r>
     </w:p>
     <w:tbl>
@@ -283,7 +283,7 @@
           </w:tcPr>
           <w:p>
             <w:r>
-              <w:t>0.0000</w:t>
+              <w:t>0.0002</w:t>
             </w:r>
           </w:p>
         </w:tc>
@@ -529,7 +529,7 @@
           </w:tcPr>
           <w:p>
             <w:r>
-              <w:t>0.0000</w:t>
+              <w:t>0.0002</w:t>
             </w:r>
           </w:p>
         </w:tc>
@@ -775,7 +775,7 @@
           </w:tcPr>
           <w:p>
             <w:r>
-              <w:t>0.0000</w:t>
+              <w:t>0.0002</w:t>
             </w:r>
           </w:p>
         </w:tc>
@@ -1794,7 +1794,7 @@
           </w:tcPr>
           <w:p>
             <w:r>
-              <w:t>-1.1926</w:t>
+              <w:t>-1.2129</w:t>
             </w:r>
           </w:p>
         </w:tc>
@@ -1804,7 +1804,7 @@
           </w:tcPr>
           <w:p>
             <w:r>
-              <w:t>0.6314</w:t>
+              <w:t>0.6346</w:t>
             </w:r>
           </w:p>
         </w:tc>
@@ -1814,7 +1814,7 @@
           </w:tcPr>
           <w:p>
             <w:r>
-              <w:t>0.8191</w:t>
+              <w:t>0.8212</w:t>
             </w:r>
           </w:p>
         </w:tc>
@@ -1824,7 +1824,7 @@
           </w:tcPr>
           <w:p>
             <w:r>
-              <w:t>-0.0768</w:t>
+              <w:t>-0.0773</w:t>
             </w:r>
           </w:p>
         </w:tc>
@@ -1834,7 +1834,7 @@
           </w:tcPr>
           <w:p>
             <w:r>
-              <w:t>0.0565</w:t>
+              <w:t>0.0563</w:t>
             </w:r>
           </w:p>
         </w:tc>
@@ -1844,7 +1844,7 @@
           </w:tcPr>
           <w:p>
             <w:r>
-              <w:t>0.0032</w:t>
+              <w:t>0.0046</w:t>
             </w:r>
           </w:p>
         </w:tc>
@@ -1854,7 +1854,7 @@
           </w:tcPr>
           <w:p>
             <w:r>
-              <w:t>0.2331</w:t>
+              <w:t>0.2253</w:t>
             </w:r>
           </w:p>
         </w:tc>
@@ -2203,7 +2203,7 @@
           </w:tcPr>
           <w:p>
             <w:r>
-              <w:t>1.4560</w:t>
+              <w:t>1.4665</w:t>
             </w:r>
           </w:p>
         </w:tc>
@@ -2223,7 +2223,7 @@
           </w:tcPr>
           <w:p>
             <w:r>
-              <w:t>0.1654</w:t>
+              <w:t>0.1665</w:t>
             </w:r>
           </w:p>
         </w:tc>
@@ -2255,7 +2255,7 @@
           </w:tcPr>
           <w:p>
             <w:r>
-              <w:t>-0.6312</w:t>
+              <w:t>-0.6439</w:t>
             </w:r>
           </w:p>
         </w:tc>
@@ -2275,7 +2275,7 @@
           </w:tcPr>
           <w:p>
             <w:r>
-              <w:t>-0.1968</w:t>
+              <w:t>-0.2007</w:t>
             </w:r>
           </w:p>
         </w:tc>

</xml_diff>

<commit_message>
docs: De-aggregate institutional Allocation Stability Index arrays into natively mapped regional subsets
</commit_message>
<xml_diff>
--- a/docs/FINAL_RESEARCH_RESULTS_COMPENDIUM.docx
+++ b/docs/FINAL_RESEARCH_RESULTS_COMPENDIUM.docx
@@ -286,7 +286,7 @@
           </w:tcPr>
           <w:p>
             <w:r>
-              <w:t>0.0002</w:t>
+              <w:t>0.0001</w:t>
             </w:r>
           </w:p>
         </w:tc>
@@ -368,7 +368,7 @@
           </w:tcPr>
           <w:p>
             <w:r>
-              <w:t>0.0117</w:t>
+              <w:t>0.0054</w:t>
             </w:r>
           </w:p>
         </w:tc>
@@ -532,7 +532,7 @@
           </w:tcPr>
           <w:p>
             <w:r>
-              <w:t>0.0002</w:t>
+              <w:t>0.0001</w:t>
             </w:r>
           </w:p>
         </w:tc>
@@ -614,7 +614,7 @@
           </w:tcPr>
           <w:p>
             <w:r>
-              <w:t>0.0117</w:t>
+              <w:t>0.0029</w:t>
             </w:r>
           </w:p>
         </w:tc>
@@ -778,7 +778,7 @@
           </w:tcPr>
           <w:p>
             <w:r>
-              <w:t>0.0002</w:t>
+              <w:t>0.0001</w:t>
             </w:r>
           </w:p>
         </w:tc>
@@ -860,7 +860,7 @@
           </w:tcPr>
           <w:p>
             <w:r>
-              <w:t>0.0117</w:t>
+              <w:t>0.0034</w:t>
             </w:r>
           </w:p>
         </w:tc>
@@ -964,6 +964,11 @@
       </w:pPr>
       <w:r>
         <w:t>Allocation Stability Index (ASI) Interpretation</w:t>
+      </w:r>
+    </w:p>
+    <w:p>
+      <w:r>
+        <w:t>The Allocation Stability Index (ASI) is computed independently for each market using the sequence of portfolio weights generated by the corresponding rolling backtest. This ensures that allocation drift reflects the specific volatility structure and optimization dynamics of each regional market rather than a single aggregated portfolio.</w:t>
       </w:r>
     </w:p>
     <w:p>

</xml_diff>